<commit_message>
chore: 행감 자료 자동 갱신 2026-09-23
</commit_message>
<xml_diff>
--- a/문서/2026_행감_자료요구목록.docx
+++ b/문서/2026_행감_자료요구목록.docx
@@ -44,7 +44,7 @@
           <w:color w:val="6B7280"/>
           <w:sz w:val="20"/>
         </w:rPr>
-        <w:t>문화체육관광위원회 · 작성 2026. 09. 18.</w:t>
+        <w:t>문화체육관광위원회 · 작성 2026. 09. 23.</w:t>
       </w:r>
     </w:p>
     <w:p>
@@ -6442,6 +6442,113 @@
           </w:p>
         </w:tc>
       </w:tr>
+      <w:tr>
+        <w:tc>
+          <w:tcPr>
+            <w:tcW w:type="dxa" w:w="737"/>
+          </w:tcPr>
+          <w:p>
+            <w:pPr>
+              <w:spacing w:after="20"/>
+              <w:jc w:val="center"/>
+            </w:pPr>
+            <w:r/>
+            <w:r>
+              <w:rPr>
+                <w:rFonts w:ascii="맑은 고딕" w:hAnsi="맑은 고딕" w:eastAsia="맑은 고딕"/>
+                <w:b w:val="0"/>
+                <w:sz w:val="19"/>
+              </w:rPr>
+              <w:t>4</w:t>
+            </w:r>
+          </w:p>
+        </w:tc>
+        <w:tc>
+          <w:tcPr>
+            <w:tcW w:type="dxa" w:w="1134"/>
+          </w:tcPr>
+          <w:p>
+            <w:pPr>
+              <w:spacing w:after="20"/>
+              <w:jc w:val="center"/>
+            </w:pPr>
+            <w:r/>
+            <w:r>
+              <w:rPr>
+                <w:rFonts w:ascii="맑은 고딕" w:hAnsi="맑은 고딕" w:eastAsia="맑은 고딕"/>
+                <w:b w:val="0"/>
+                <w:sz w:val="19"/>
+              </w:rPr>
+              <w:t>상임위원</w:t>
+            </w:r>
+          </w:p>
+        </w:tc>
+        <w:tc>
+          <w:tcPr>
+            <w:tcW w:type="dxa" w:w="6350"/>
+          </w:tcPr>
+          <w:p>
+            <w:pPr>
+              <w:spacing w:after="20"/>
+            </w:pPr>
+            <w:r/>
+            <w:r>
+              <w:rPr>
+                <w:rFonts w:ascii="맑은 고딕" w:hAnsi="맑은 고딕" w:eastAsia="맑은 고딕"/>
+                <w:b/>
+                <w:sz w:val="19"/>
+              </w:rPr>
+              <w:t>∘ 경기도 관광 성과지표 현황 및 개편 검토</w:t>
+            </w:r>
+          </w:p>
+          <w:p>
+            <w:pPr>
+              <w:spacing w:after="20"/>
+            </w:pPr>
+            <w:r>
+              <w:rPr>
+                <w:rFonts w:ascii="맑은 고딕" w:hAnsi="맑은 고딕" w:eastAsia="맑은 고딕"/>
+                <w:b w:val="0"/>
+                <w:sz w:val="19"/>
+              </w:rPr>
+              <w:t xml:space="preserve"> - 최근 3년 관광정책 성과지표(방문객수·체류일수·소비액 등) 관리 현황</w:t>
+            </w:r>
+          </w:p>
+          <w:p>
+            <w:pPr>
+              <w:spacing w:after="20"/>
+            </w:pPr>
+            <w:r>
+              <w:rPr>
+                <w:rFonts w:ascii="맑은 고딕" w:hAnsi="맑은 고딕" w:eastAsia="맑은 고딕"/>
+                <w:b w:val="0"/>
+                <w:sz w:val="19"/>
+              </w:rPr>
+              <w:t xml:space="preserve"> - 체류·소비 중심 지표 도입 검토 여부</w:t>
+            </w:r>
+          </w:p>
+        </w:tc>
+        <w:tc>
+          <w:tcPr>
+            <w:tcW w:type="dxa" w:w="1304"/>
+          </w:tcPr>
+          <w:p>
+            <w:pPr>
+              <w:spacing w:after="20"/>
+              <w:jc w:val="center"/>
+            </w:pPr>
+            <w:r/>
+            <w:r>
+              <w:rPr>
+                <w:rFonts w:ascii="맑은 고딕" w:hAnsi="맑은 고딕" w:eastAsia="맑은 고딕"/>
+                <w:b w:val="0"/>
+                <w:sz w:val="17"/>
+              </w:rPr>
+              <w:t>관광산업-4</w:t>
+            </w:r>
+          </w:p>
+        </w:tc>
+      </w:tr>
     </w:tbl>
     <w:p>
       <w:pPr>
@@ -8296,6 +8403,113 @@
                 <w:sz w:val="17"/>
               </w:rPr>
               <w:t>콘진원-2</w:t>
+            </w:r>
+          </w:p>
+        </w:tc>
+      </w:tr>
+      <w:tr>
+        <w:tc>
+          <w:tcPr>
+            <w:tcW w:type="dxa" w:w="737"/>
+          </w:tcPr>
+          <w:p>
+            <w:pPr>
+              <w:spacing w:after="20"/>
+              <w:jc w:val="center"/>
+            </w:pPr>
+            <w:r/>
+            <w:r>
+              <w:rPr>
+                <w:rFonts w:ascii="맑은 고딕" w:hAnsi="맑은 고딕" w:eastAsia="맑은 고딕"/>
+                <w:b w:val="0"/>
+                <w:sz w:val="19"/>
+              </w:rPr>
+              <w:t>3</w:t>
+            </w:r>
+          </w:p>
+        </w:tc>
+        <w:tc>
+          <w:tcPr>
+            <w:tcW w:type="dxa" w:w="1134"/>
+          </w:tcPr>
+          <w:p>
+            <w:pPr>
+              <w:spacing w:after="20"/>
+              <w:jc w:val="center"/>
+            </w:pPr>
+            <w:r/>
+            <w:r>
+              <w:rPr>
+                <w:rFonts w:ascii="맑은 고딕" w:hAnsi="맑은 고딕" w:eastAsia="맑은 고딕"/>
+                <w:b w:val="0"/>
+                <w:sz w:val="19"/>
+              </w:rPr>
+              <w:t>상임위원</w:t>
+            </w:r>
+          </w:p>
+        </w:tc>
+        <w:tc>
+          <w:tcPr>
+            <w:tcW w:type="dxa" w:w="6350"/>
+          </w:tcPr>
+          <w:p>
+            <w:pPr>
+              <w:spacing w:after="20"/>
+            </w:pPr>
+            <w:r/>
+            <w:r>
+              <w:rPr>
+                <w:rFonts w:ascii="맑은 고딕" w:hAnsi="맑은 고딕" w:eastAsia="맑은 고딕"/>
+                <w:b/>
+                <w:sz w:val="19"/>
+              </w:rPr>
+              <w:t>∘ 도내 창작자·기업 해외 콘텐츠 불법유통 대응 현황</w:t>
+            </w:r>
+          </w:p>
+          <w:p>
+            <w:pPr>
+              <w:spacing w:after="20"/>
+            </w:pPr>
+            <w:r>
+              <w:rPr>
+                <w:rFonts w:ascii="맑은 고딕" w:hAnsi="맑은 고딕" w:eastAsia="맑은 고딕"/>
+                <w:b w:val="0"/>
+                <w:sz w:val="19"/>
+              </w:rPr>
+              <w:t xml:space="preserve"> - 최근 3년 해외 불법유통 모니터링·신고 건수(연도별)</w:t>
+            </w:r>
+          </w:p>
+          <w:p>
+            <w:pPr>
+              <w:spacing w:after="20"/>
+            </w:pPr>
+            <w:r>
+              <w:rPr>
+                <w:rFonts w:ascii="맑은 고딕" w:hAnsi="맑은 고딕" w:eastAsia="맑은 고딕"/>
+                <w:b w:val="0"/>
+                <w:sz w:val="19"/>
+              </w:rPr>
+              <w:t xml:space="preserve"> - 저작권 침해 법률자문·소송 지원 등 구제 실적</w:t>
+            </w:r>
+          </w:p>
+        </w:tc>
+        <w:tc>
+          <w:tcPr>
+            <w:tcW w:type="dxa" w:w="1304"/>
+          </w:tcPr>
+          <w:p>
+            <w:pPr>
+              <w:spacing w:after="20"/>
+              <w:jc w:val="center"/>
+            </w:pPr>
+            <w:r/>
+            <w:r>
+              <w:rPr>
+                <w:rFonts w:ascii="맑은 고딕" w:hAnsi="맑은 고딕" w:eastAsia="맑은 고딕"/>
+                <w:b w:val="0"/>
+                <w:sz w:val="17"/>
+              </w:rPr>
+              <w:t>콘진원-3</w:t>
             </w:r>
           </w:p>
         </w:tc>

</xml_diff>

<commit_message>
chore: 행감 자료 자동 갱신 2026-10-01
</commit_message>
<xml_diff>
--- a/문서/2026_행감_자료요구목록.docx
+++ b/문서/2026_행감_자료요구목록.docx
@@ -44,7 +44,7 @@
           <w:color w:val="6B7280"/>
           <w:sz w:val="20"/>
         </w:rPr>
-        <w:t>문화체육관광위원회 · 작성 2026. 09. 28.</w:t>
+        <w:t>문화체육관광위원회 · 작성 2026. 10. 01.</w:t>
       </w:r>
     </w:p>
     <w:p>
@@ -6549,6 +6549,139 @@
           </w:p>
         </w:tc>
       </w:tr>
+      <w:tr>
+        <w:tc>
+          <w:tcPr>
+            <w:tcW w:type="dxa" w:w="737"/>
+          </w:tcPr>
+          <w:p>
+            <w:pPr>
+              <w:spacing w:after="20"/>
+              <w:jc w:val="center"/>
+            </w:pPr>
+            <w:r/>
+            <w:r>
+              <w:rPr>
+                <w:rFonts w:ascii="맑은 고딕" w:hAnsi="맑은 고딕" w:eastAsia="맑은 고딕"/>
+                <w:b w:val="0"/>
+                <w:sz w:val="19"/>
+              </w:rPr>
+              <w:t>5</w:t>
+            </w:r>
+          </w:p>
+        </w:tc>
+        <w:tc>
+          <w:tcPr>
+            <w:tcW w:type="dxa" w:w="1134"/>
+          </w:tcPr>
+          <w:p>
+            <w:pPr>
+              <w:spacing w:after="20"/>
+              <w:jc w:val="center"/>
+            </w:pPr>
+            <w:r/>
+            <w:r>
+              <w:rPr>
+                <w:rFonts w:ascii="맑은 고딕" w:hAnsi="맑은 고딕" w:eastAsia="맑은 고딕"/>
+                <w:b w:val="0"/>
+                <w:sz w:val="19"/>
+              </w:rPr>
+              <w:t>상임위원</w:t>
+            </w:r>
+          </w:p>
+        </w:tc>
+        <w:tc>
+          <w:tcPr>
+            <w:tcW w:type="dxa" w:w="6350"/>
+          </w:tcPr>
+          <w:p>
+            <w:pPr>
+              <w:spacing w:after="20"/>
+            </w:pPr>
+            <w:r/>
+            <w:r>
+              <w:rPr>
+                <w:rFonts w:ascii="맑은 고딕" w:hAnsi="맑은 고딕" w:eastAsia="맑은 고딕"/>
+                <w:b/>
+                <w:sz w:val="19"/>
+              </w:rPr>
+              <w:t>∘ 도내 야영장 안전점검 및 후속조치 현황(2024~2026.9.)</w:t>
+            </w:r>
+          </w:p>
+          <w:p>
+            <w:pPr>
+              <w:spacing w:after="20"/>
+            </w:pPr>
+            <w:r>
+              <w:rPr>
+                <w:rFonts w:ascii="맑은 고딕" w:hAnsi="맑은 고딕" w:eastAsia="맑은 고딕"/>
+                <w:b w:val="0"/>
+                <w:sz w:val="19"/>
+              </w:rPr>
+              <w:t xml:space="preserve"> - 시군별 등록 야영장 수</w:t>
+            </w:r>
+          </w:p>
+          <w:p>
+            <w:pPr>
+              <w:spacing w:after="20"/>
+            </w:pPr>
+            <w:r>
+              <w:rPr>
+                <w:rFonts w:ascii="맑은 고딕" w:hAnsi="맑은 고딕" w:eastAsia="맑은 고딕"/>
+                <w:b w:val="0"/>
+                <w:sz w:val="19"/>
+              </w:rPr>
+              <w:t xml:space="preserve"> - 안전점검 실시 및 위반 적발 건수</w:t>
+            </w:r>
+          </w:p>
+          <w:p>
+            <w:pPr>
+              <w:spacing w:after="20"/>
+            </w:pPr>
+            <w:r>
+              <w:rPr>
+                <w:rFonts w:ascii="맑은 고딕" w:hAnsi="맑은 고딕" w:eastAsia="맑은 고딕"/>
+                <w:b w:val="0"/>
+                <w:sz w:val="19"/>
+              </w:rPr>
+              <w:t xml:space="preserve"> - 행정처분·시정명령 및 이행 완료 현황</w:t>
+            </w:r>
+          </w:p>
+          <w:p>
+            <w:pPr>
+              <w:spacing w:after="20"/>
+            </w:pPr>
+            <w:r>
+              <w:rPr>
+                <w:rFonts w:ascii="맑은 고딕" w:hAnsi="맑은 고딕" w:eastAsia="맑은 고딕"/>
+                <w:b w:val="0"/>
+                <w:sz w:val="19"/>
+              </w:rPr>
+              <w:t xml:space="preserve"> - 미등록 야영장 단속 실적</w:t>
+            </w:r>
+          </w:p>
+        </w:tc>
+        <w:tc>
+          <w:tcPr>
+            <w:tcW w:type="dxa" w:w="1304"/>
+          </w:tcPr>
+          <w:p>
+            <w:pPr>
+              <w:spacing w:after="20"/>
+              <w:jc w:val="center"/>
+            </w:pPr>
+            <w:r/>
+            <w:r>
+              <w:rPr>
+                <w:rFonts w:ascii="맑은 고딕" w:hAnsi="맑은 고딕" w:eastAsia="맑은 고딕"/>
+                <w:b w:val="0"/>
+                <w:sz w:val="17"/>
+              </w:rPr>
+              <w:t>관광산업-5</w:t>
+            </w:r>
+          </w:p>
+        </w:tc>
+      </w:tr>
     </w:tbl>
     <w:p>
       <w:pPr>
@@ -7628,6 +7761,126 @@
                 <w:sz w:val="17"/>
               </w:rPr>
               <w:t>문화재단-2</w:t>
+            </w:r>
+          </w:p>
+        </w:tc>
+      </w:tr>
+      <w:tr>
+        <w:tc>
+          <w:tcPr>
+            <w:tcW w:type="dxa" w:w="737"/>
+          </w:tcPr>
+          <w:p>
+            <w:pPr>
+              <w:spacing w:after="20"/>
+              <w:jc w:val="center"/>
+            </w:pPr>
+            <w:r/>
+            <w:r>
+              <w:rPr>
+                <w:rFonts w:ascii="맑은 고딕" w:hAnsi="맑은 고딕" w:eastAsia="맑은 고딕"/>
+                <w:b w:val="0"/>
+                <w:sz w:val="19"/>
+              </w:rPr>
+              <w:t>3</w:t>
+            </w:r>
+          </w:p>
+        </w:tc>
+        <w:tc>
+          <w:tcPr>
+            <w:tcW w:type="dxa" w:w="1134"/>
+          </w:tcPr>
+          <w:p>
+            <w:pPr>
+              <w:spacing w:after="20"/>
+              <w:jc w:val="center"/>
+            </w:pPr>
+            <w:r/>
+            <w:r>
+              <w:rPr>
+                <w:rFonts w:ascii="맑은 고딕" w:hAnsi="맑은 고딕" w:eastAsia="맑은 고딕"/>
+                <w:b w:val="0"/>
+                <w:sz w:val="19"/>
+              </w:rPr>
+              <w:t>상임위원</w:t>
+            </w:r>
+          </w:p>
+        </w:tc>
+        <w:tc>
+          <w:tcPr>
+            <w:tcW w:type="dxa" w:w="6350"/>
+          </w:tcPr>
+          <w:p>
+            <w:pPr>
+              <w:spacing w:after="20"/>
+            </w:pPr>
+            <w:r/>
+            <w:r>
+              <w:rPr>
+                <w:rFonts w:ascii="맑은 고딕" w:hAnsi="맑은 고딕" w:eastAsia="맑은 고딕"/>
+                <w:b/>
+                <w:sz w:val="19"/>
+              </w:rPr>
+              <w:t>∘ 경기창작캠퍼스 운영 현황 및 2027 레지던시 재개 계획</w:t>
+            </w:r>
+          </w:p>
+          <w:p>
+            <w:pPr>
+              <w:spacing w:after="20"/>
+            </w:pPr>
+            <w:r>
+              <w:rPr>
+                <w:rFonts w:ascii="맑은 고딕" w:hAnsi="맑은 고딕" w:eastAsia="맑은 고딕"/>
+                <w:b w:val="0"/>
+                <w:sz w:val="19"/>
+              </w:rPr>
+              <w:t xml:space="preserve"> - 최근 3년 레지던시 운영 실적(입주 작가 수·예산)</w:t>
+            </w:r>
+          </w:p>
+          <w:p>
+            <w:pPr>
+              <w:spacing w:after="20"/>
+            </w:pPr>
+            <w:r>
+              <w:rPr>
+                <w:rFonts w:ascii="맑은 고딕" w:hAnsi="맑은 고딕" w:eastAsia="맑은 고딕"/>
+                <w:b w:val="0"/>
+                <w:sz w:val="19"/>
+              </w:rPr>
+              <w:t xml:space="preserve"> - 운영 중단 기간·사유 및 공간 관리 비용</w:t>
+            </w:r>
+          </w:p>
+          <w:p>
+            <w:pPr>
+              <w:spacing w:after="20"/>
+            </w:pPr>
+            <w:r>
+              <w:rPr>
+                <w:rFonts w:ascii="맑은 고딕" w:hAnsi="맑은 고딕" w:eastAsia="맑은 고딕"/>
+                <w:b w:val="0"/>
+                <w:sz w:val="19"/>
+              </w:rPr>
+              <w:t xml:space="preserve"> - 2027 정규 레지던시 예산·입주 규모·선정 절차·재원</w:t>
+            </w:r>
+          </w:p>
+        </w:tc>
+        <w:tc>
+          <w:tcPr>
+            <w:tcW w:type="dxa" w:w="1304"/>
+          </w:tcPr>
+          <w:p>
+            <w:pPr>
+              <w:spacing w:after="20"/>
+              <w:jc w:val="center"/>
+            </w:pPr>
+            <w:r/>
+            <w:r>
+              <w:rPr>
+                <w:rFonts w:ascii="맑은 고딕" w:hAnsi="맑은 고딕" w:eastAsia="맑은 고딕"/>
+                <w:b w:val="0"/>
+                <w:sz w:val="17"/>
+              </w:rPr>
+              <w:t>문화재단-3</w:t>
             </w:r>
           </w:p>
         </w:tc>

</xml_diff>

<commit_message>
chore: 행감 자료 자동 갱신 2026-10-02
</commit_message>
<xml_diff>
--- a/문서/2026_행감_자료요구목록.docx
+++ b/문서/2026_행감_자료요구목록.docx
@@ -44,7 +44,7 @@
           <w:color w:val="6B7280"/>
           <w:sz w:val="20"/>
         </w:rPr>
-        <w:t>문화체육관광위원회 · 작성 2026. 10. 01.</w:t>
+        <w:t>문화체육관광위원회 · 작성 2026. 10. 02.</w:t>
       </w:r>
     </w:p>
     <w:p>
@@ -2041,6 +2041,126 @@
                 <w:sz w:val="17"/>
               </w:rPr>
               <w:t>공통-17</w:t>
+            </w:r>
+          </w:p>
+        </w:tc>
+      </w:tr>
+      <w:tr>
+        <w:tc>
+          <w:tcPr>
+            <w:tcW w:type="dxa" w:w="737"/>
+          </w:tcPr>
+          <w:p>
+            <w:pPr>
+              <w:spacing w:after="20"/>
+              <w:jc w:val="center"/>
+            </w:pPr>
+            <w:r/>
+            <w:r>
+              <w:rPr>
+                <w:rFonts w:ascii="맑은 고딕" w:hAnsi="맑은 고딕" w:eastAsia="맑은 고딕"/>
+                <w:b w:val="0"/>
+                <w:sz w:val="19"/>
+              </w:rPr>
+              <w:t>18</w:t>
+            </w:r>
+          </w:p>
+        </w:tc>
+        <w:tc>
+          <w:tcPr>
+            <w:tcW w:type="dxa" w:w="1134"/>
+          </w:tcPr>
+          <w:p>
+            <w:pPr>
+              <w:spacing w:after="20"/>
+              <w:jc w:val="center"/>
+            </w:pPr>
+            <w:r/>
+            <w:r>
+              <w:rPr>
+                <w:rFonts w:ascii="맑은 고딕" w:hAnsi="맑은 고딕" w:eastAsia="맑은 고딕"/>
+                <w:b w:val="0"/>
+                <w:sz w:val="19"/>
+              </w:rPr>
+              <w:t>상임위원</w:t>
+            </w:r>
+          </w:p>
+        </w:tc>
+        <w:tc>
+          <w:tcPr>
+            <w:tcW w:type="dxa" w:w="6350"/>
+          </w:tcPr>
+          <w:p>
+            <w:pPr>
+              <w:spacing w:after="20"/>
+            </w:pPr>
+            <w:r/>
+            <w:r>
+              <w:rPr>
+                <w:rFonts w:ascii="맑은 고딕" w:hAnsi="맑은 고딕" w:eastAsia="맑은 고딕"/>
+                <w:b/>
+                <w:sz w:val="19"/>
+              </w:rPr>
+              <w:t>∘ 세입세출외현금(보증금·보관금 등) 관리 현황(2024~2026.9.)</w:t>
+            </w:r>
+          </w:p>
+          <w:p>
+            <w:pPr>
+              <w:spacing w:after="20"/>
+            </w:pPr>
+            <w:r>
+              <w:rPr>
+                <w:rFonts w:ascii="맑은 고딕" w:hAnsi="맑은 고딕" w:eastAsia="맑은 고딕"/>
+                <w:b w:val="0"/>
+                <w:sz w:val="19"/>
+              </w:rPr>
+              <w:t xml:space="preserve"> - 계좌별 잔액, 발생·반환 내역</w:t>
+            </w:r>
+          </w:p>
+          <w:p>
+            <w:pPr>
+              <w:spacing w:after="20"/>
+            </w:pPr>
+            <w:r>
+              <w:rPr>
+                <w:rFonts w:ascii="맑은 고딕" w:hAnsi="맑은 고딕" w:eastAsia="맑은 고딕"/>
+                <w:b w:val="0"/>
+                <w:sz w:val="19"/>
+              </w:rPr>
+              <w:t xml:space="preserve"> - 1년 이상 장기 미반환·미정리 잔액과 사유</w:t>
+            </w:r>
+          </w:p>
+          <w:p>
+            <w:pPr>
+              <w:spacing w:after="20"/>
+            </w:pPr>
+            <w:r>
+              <w:rPr>
+                <w:rFonts w:ascii="맑은 고딕" w:hAnsi="맑은 고딕" w:eastAsia="맑은 고딕"/>
+                <w:b w:val="0"/>
+                <w:sz w:val="19"/>
+              </w:rPr>
+              <w:t xml:space="preserve"> - 최근 감사 지적 및 조치 결과</w:t>
+            </w:r>
+          </w:p>
+        </w:tc>
+        <w:tc>
+          <w:tcPr>
+            <w:tcW w:type="dxa" w:w="1304"/>
+          </w:tcPr>
+          <w:p>
+            <w:pPr>
+              <w:spacing w:after="20"/>
+              <w:jc w:val="center"/>
+            </w:pPr>
+            <w:r/>
+            <w:r>
+              <w:rPr>
+                <w:rFonts w:ascii="맑은 고딕" w:hAnsi="맑은 고딕" w:eastAsia="맑은 고딕"/>
+                <w:b w:val="0"/>
+                <w:sz w:val="17"/>
+              </w:rPr>
+              <w:t>공통-18</w:t>
             </w:r>
           </w:p>
         </w:tc>
@@ -4477,6 +4597,113 @@
           </w:p>
         </w:tc>
       </w:tr>
+      <w:tr>
+        <w:tc>
+          <w:tcPr>
+            <w:tcW w:type="dxa" w:w="737"/>
+          </w:tcPr>
+          <w:p>
+            <w:pPr>
+              <w:spacing w:after="20"/>
+              <w:jc w:val="center"/>
+            </w:pPr>
+            <w:r/>
+            <w:r>
+              <w:rPr>
+                <w:rFonts w:ascii="맑은 고딕" w:hAnsi="맑은 고딕" w:eastAsia="맑은 고딕"/>
+                <w:b w:val="0"/>
+                <w:sz w:val="19"/>
+              </w:rPr>
+              <w:t>5</w:t>
+            </w:r>
+          </w:p>
+        </w:tc>
+        <w:tc>
+          <w:tcPr>
+            <w:tcW w:type="dxa" w:w="1134"/>
+          </w:tcPr>
+          <w:p>
+            <w:pPr>
+              <w:spacing w:after="20"/>
+              <w:jc w:val="center"/>
+            </w:pPr>
+            <w:r/>
+            <w:r>
+              <w:rPr>
+                <w:rFonts w:ascii="맑은 고딕" w:hAnsi="맑은 고딕" w:eastAsia="맑은 고딕"/>
+                <w:b w:val="0"/>
+                <w:sz w:val="19"/>
+              </w:rPr>
+              <w:t>상임위원</w:t>
+            </w:r>
+          </w:p>
+        </w:tc>
+        <w:tc>
+          <w:tcPr>
+            <w:tcW w:type="dxa" w:w="6350"/>
+          </w:tcPr>
+          <w:p>
+            <w:pPr>
+              <w:spacing w:after="20"/>
+            </w:pPr>
+            <w:r/>
+            <w:r>
+              <w:rPr>
+                <w:rFonts w:ascii="맑은 고딕" w:hAnsi="맑은 고딕" w:eastAsia="맑은 고딕"/>
+                <w:b/>
+                <w:sz w:val="19"/>
+              </w:rPr>
+              <w:t>∘ 도내 국제영화제 도비 지원 현황(2022~2027 계획)</w:t>
+            </w:r>
+          </w:p>
+          <w:p>
+            <w:pPr>
+              <w:spacing w:after="20"/>
+            </w:pPr>
+            <w:r>
+              <w:rPr>
+                <w:rFonts w:ascii="맑은 고딕" w:hAnsi="맑은 고딕" w:eastAsia="맑은 고딕"/>
+                <w:b w:val="0"/>
+                <w:sz w:val="19"/>
+              </w:rPr>
+              <w:t xml:space="preserve"> - 영화제별 도비·국비·시군비 연도별 금액</w:t>
+            </w:r>
+          </w:p>
+          <w:p>
+            <w:pPr>
+              <w:spacing w:after="20"/>
+            </w:pPr>
+            <w:r>
+              <w:rPr>
+                <w:rFonts w:ascii="맑은 고딕" w:hAnsi="맑은 고딕" w:eastAsia="맑은 고딕"/>
+                <w:b w:val="0"/>
+                <w:sz w:val="19"/>
+              </w:rPr>
+              <w:t xml:space="preserve"> - 지원 기준·성과평가 방식, 협약 기간</w:t>
+            </w:r>
+          </w:p>
+        </w:tc>
+        <w:tc>
+          <w:tcPr>
+            <w:tcW w:type="dxa" w:w="1304"/>
+          </w:tcPr>
+          <w:p>
+            <w:pPr>
+              <w:spacing w:after="20"/>
+              <w:jc w:val="center"/>
+            </w:pPr>
+            <w:r/>
+            <w:r>
+              <w:rPr>
+                <w:rFonts w:ascii="맑은 고딕" w:hAnsi="맑은 고딕" w:eastAsia="맑은 고딕"/>
+                <w:b w:val="0"/>
+                <w:sz w:val="17"/>
+              </w:rPr>
+              <w:t>콘텐츠-5</w:t>
+            </w:r>
+          </w:p>
+        </w:tc>
+      </w:tr>
     </w:tbl>
     <w:p>
       <w:pPr>
@@ -6001,6 +6228,113 @@
           </w:p>
         </w:tc>
       </w:tr>
+      <w:tr>
+        <w:tc>
+          <w:tcPr>
+            <w:tcW w:type="dxa" w:w="737"/>
+          </w:tcPr>
+          <w:p>
+            <w:pPr>
+              <w:spacing w:after="20"/>
+              <w:jc w:val="center"/>
+            </w:pPr>
+            <w:r/>
+            <w:r>
+              <w:rPr>
+                <w:rFonts w:ascii="맑은 고딕" w:hAnsi="맑은 고딕" w:eastAsia="맑은 고딕"/>
+                <w:b w:val="0"/>
+                <w:sz w:val="19"/>
+              </w:rPr>
+              <w:t>4</w:t>
+            </w:r>
+          </w:p>
+        </w:tc>
+        <w:tc>
+          <w:tcPr>
+            <w:tcW w:type="dxa" w:w="1134"/>
+          </w:tcPr>
+          <w:p>
+            <w:pPr>
+              <w:spacing w:after="20"/>
+              <w:jc w:val="center"/>
+            </w:pPr>
+            <w:r/>
+            <w:r>
+              <w:rPr>
+                <w:rFonts w:ascii="맑은 고딕" w:hAnsi="맑은 고딕" w:eastAsia="맑은 고딕"/>
+                <w:b w:val="0"/>
+                <w:sz w:val="19"/>
+              </w:rPr>
+              <w:t>상임위원</w:t>
+            </w:r>
+          </w:p>
+        </w:tc>
+        <w:tc>
+          <w:tcPr>
+            <w:tcW w:type="dxa" w:w="6350"/>
+          </w:tcPr>
+          <w:p>
+            <w:pPr>
+              <w:spacing w:after="20"/>
+            </w:pPr>
+            <w:r/>
+            <w:r>
+              <w:rPr>
+                <w:rFonts w:ascii="맑은 고딕" w:hAnsi="맑은 고딕" w:eastAsia="맑은 고딕"/>
+                <w:b/>
+                <w:sz w:val="19"/>
+              </w:rPr>
+              <w:t>∘ 도·산하기관 발주 공사 매장유산 발견 및 조치 현황(2023~2026.9.)</w:t>
+            </w:r>
+          </w:p>
+          <w:p>
+            <w:pPr>
+              <w:spacing w:after="20"/>
+            </w:pPr>
+            <w:r>
+              <w:rPr>
+                <w:rFonts w:ascii="맑은 고딕" w:hAnsi="맑은 고딕" w:eastAsia="맑은 고딕"/>
+                <w:b w:val="0"/>
+                <w:sz w:val="19"/>
+              </w:rPr>
+              <w:t xml:space="preserve"> - 공사명, 발견 유물 수량, 신고일·보고 내용</w:t>
+            </w:r>
+          </w:p>
+          <w:p>
+            <w:pPr>
+              <w:spacing w:after="20"/>
+            </w:pPr>
+            <w:r>
+              <w:rPr>
+                <w:rFonts w:ascii="맑은 고딕" w:hAnsi="맑은 고딕" w:eastAsia="맑은 고딕"/>
+                <w:b w:val="0"/>
+                <w:sz w:val="19"/>
+              </w:rPr>
+              <w:t xml:space="preserve"> - 공사 중지·조사 결과와 처리</w:t>
+            </w:r>
+          </w:p>
+        </w:tc>
+        <w:tc>
+          <w:tcPr>
+            <w:tcW w:type="dxa" w:w="1304"/>
+          </w:tcPr>
+          <w:p>
+            <w:pPr>
+              <w:spacing w:after="20"/>
+              <w:jc w:val="center"/>
+            </w:pPr>
+            <w:r/>
+            <w:r>
+              <w:rPr>
+                <w:rFonts w:ascii="맑은 고딕" w:hAnsi="맑은 고딕" w:eastAsia="맑은 고딕"/>
+                <w:b w:val="0"/>
+                <w:sz w:val="17"/>
+              </w:rPr>
+              <w:t>문화유산-4</w:t>
+            </w:r>
+          </w:p>
+        </w:tc>
+      </w:tr>
     </w:tbl>
     <w:p>
       <w:pPr>
@@ -9833,6 +10167,113 @@
                 <w:sz w:val="17"/>
               </w:rPr>
               <w:t>도체육회-3</w:t>
+            </w:r>
+          </w:p>
+        </w:tc>
+      </w:tr>
+      <w:tr>
+        <w:tc>
+          <w:tcPr>
+            <w:tcW w:type="dxa" w:w="737"/>
+          </w:tcPr>
+          <w:p>
+            <w:pPr>
+              <w:spacing w:after="20"/>
+              <w:jc w:val="center"/>
+            </w:pPr>
+            <w:r/>
+            <w:r>
+              <w:rPr>
+                <w:rFonts w:ascii="맑은 고딕" w:hAnsi="맑은 고딕" w:eastAsia="맑은 고딕"/>
+                <w:b w:val="0"/>
+                <w:sz w:val="19"/>
+              </w:rPr>
+              <w:t>4</w:t>
+            </w:r>
+          </w:p>
+        </w:tc>
+        <w:tc>
+          <w:tcPr>
+            <w:tcW w:type="dxa" w:w="1134"/>
+          </w:tcPr>
+          <w:p>
+            <w:pPr>
+              <w:spacing w:after="20"/>
+              <w:jc w:val="center"/>
+            </w:pPr>
+            <w:r/>
+            <w:r>
+              <w:rPr>
+                <w:rFonts w:ascii="맑은 고딕" w:hAnsi="맑은 고딕" w:eastAsia="맑은 고딕"/>
+                <w:b w:val="0"/>
+                <w:sz w:val="19"/>
+              </w:rPr>
+              <w:t>상임위원</w:t>
+            </w:r>
+          </w:p>
+        </w:tc>
+        <w:tc>
+          <w:tcPr>
+            <w:tcW w:type="dxa" w:w="6350"/>
+          </w:tcPr>
+          <w:p>
+            <w:pPr>
+              <w:spacing w:after="20"/>
+            </w:pPr>
+            <w:r/>
+            <w:r>
+              <w:rPr>
+                <w:rFonts w:ascii="맑은 고딕" w:hAnsi="맑은 고딕" w:eastAsia="맑은 고딕"/>
+                <w:b/>
+                <w:sz w:val="19"/>
+              </w:rPr>
+              <w:t>∘ 시군체육회 종목단체 관리단체 지정 현황(2024~2026.9.)</w:t>
+            </w:r>
+          </w:p>
+          <w:p>
+            <w:pPr>
+              <w:spacing w:after="20"/>
+            </w:pPr>
+            <w:r>
+              <w:rPr>
+                <w:rFonts w:ascii="맑은 고딕" w:hAnsi="맑은 고딕" w:eastAsia="맑은 고딕"/>
+                <w:b w:val="0"/>
+                <w:sz w:val="19"/>
+              </w:rPr>
+              <w:t xml:space="preserve"> - 시군별 종목단체 수, 자격정지·관리단체 지정 건수와 사유</w:t>
+            </w:r>
+          </w:p>
+          <w:p>
+            <w:pPr>
+              <w:spacing w:after="20"/>
+            </w:pPr>
+            <w:r>
+              <w:rPr>
+                <w:rFonts w:ascii="맑은 고딕" w:hAnsi="맑은 고딕" w:eastAsia="맑은 고딕"/>
+                <w:b w:val="0"/>
+                <w:sz w:val="19"/>
+              </w:rPr>
+              <w:t xml:space="preserve"> - 지정 유예 단체와 유예 사유, 도체육회 지도·점검 내역</w:t>
+            </w:r>
+          </w:p>
+        </w:tc>
+        <w:tc>
+          <w:tcPr>
+            <w:tcW w:type="dxa" w:w="1304"/>
+          </w:tcPr>
+          <w:p>
+            <w:pPr>
+              <w:spacing w:after="20"/>
+              <w:jc w:val="center"/>
+            </w:pPr>
+            <w:r/>
+            <w:r>
+              <w:rPr>
+                <w:rFonts w:ascii="맑은 고딕" w:hAnsi="맑은 고딕" w:eastAsia="맑은 고딕"/>
+                <w:b w:val="0"/>
+                <w:sz w:val="17"/>
+              </w:rPr>
+              <w:t>도체육회-4</w:t>
             </w:r>
           </w:p>
         </w:tc>

</xml_diff>

<commit_message>
chore: 행감 자료 자동 갱신 2026-10-19
</commit_message>
<xml_diff>
--- a/문서/2026_행감_자료요구목록.docx
+++ b/문서/2026_행감_자료요구목록.docx
@@ -44,7 +44,7 @@
           <w:color w:val="6B7280"/>
           <w:sz w:val="20"/>
         </w:rPr>
-        <w:t>문화체육관광위원회 · 작성 2026. 10. 02.</w:t>
+        <w:t>문화체육관광위원회 · 작성 2026. 10. 19.</w:t>
       </w:r>
     </w:p>
     <w:p>
@@ -2161,6 +2161,139 @@
                 <w:sz w:val="17"/>
               </w:rPr>
               <w:t>공통-18</w:t>
+            </w:r>
+          </w:p>
+        </w:tc>
+      </w:tr>
+      <w:tr>
+        <w:tc>
+          <w:tcPr>
+            <w:tcW w:type="dxa" w:w="737"/>
+          </w:tcPr>
+          <w:p>
+            <w:pPr>
+              <w:spacing w:after="20"/>
+              <w:jc w:val="center"/>
+            </w:pPr>
+            <w:r/>
+            <w:r>
+              <w:rPr>
+                <w:rFonts w:ascii="맑은 고딕" w:hAnsi="맑은 고딕" w:eastAsia="맑은 고딕"/>
+                <w:b w:val="0"/>
+                <w:sz w:val="19"/>
+              </w:rPr>
+              <w:t>19</w:t>
+            </w:r>
+          </w:p>
+        </w:tc>
+        <w:tc>
+          <w:tcPr>
+            <w:tcW w:type="dxa" w:w="1134"/>
+          </w:tcPr>
+          <w:p>
+            <w:pPr>
+              <w:spacing w:after="20"/>
+              <w:jc w:val="center"/>
+            </w:pPr>
+            <w:r/>
+            <w:r>
+              <w:rPr>
+                <w:rFonts w:ascii="맑은 고딕" w:hAnsi="맑은 고딕" w:eastAsia="맑은 고딕"/>
+                <w:b w:val="0"/>
+                <w:sz w:val="19"/>
+              </w:rPr>
+              <w:t>상임위원</w:t>
+            </w:r>
+          </w:p>
+        </w:tc>
+        <w:tc>
+          <w:tcPr>
+            <w:tcW w:type="dxa" w:w="6350"/>
+          </w:tcPr>
+          <w:p>
+            <w:pPr>
+              <w:spacing w:after="20"/>
+            </w:pPr>
+            <w:r/>
+            <w:r>
+              <w:rPr>
+                <w:rFonts w:ascii="맑은 고딕" w:hAnsi="맑은 고딕" w:eastAsia="맑은 고딕"/>
+                <w:b/>
+                <w:sz w:val="19"/>
+              </w:rPr>
+              <w:t>∘ 각종 위원회·심의회 구성과 운영 규정 공개 현황 (2024~2026. 10.)</w:t>
+            </w:r>
+          </w:p>
+          <w:p>
+            <w:pPr>
+              <w:spacing w:after="20"/>
+            </w:pPr>
+            <w:r>
+              <w:rPr>
+                <w:rFonts w:ascii="맑은 고딕" w:hAnsi="맑은 고딕" w:eastAsia="맑은 고딕"/>
+                <w:b w:val="0"/>
+                <w:sz w:val="19"/>
+              </w:rPr>
+              <w:t xml:space="preserve"> - 위원회별 설치근거, 위원 선정 기준과 공모 여부, 회칙·운영규정 보유 및 공개 여부</w:t>
+            </w:r>
+          </w:p>
+          <w:p>
+            <w:pPr>
+              <w:spacing w:after="20"/>
+            </w:pPr>
+            <w:r>
+              <w:rPr>
+                <w:rFonts w:ascii="맑은 고딕" w:hAnsi="맑은 고딕" w:eastAsia="맑은 고딕"/>
+                <w:b w:val="0"/>
+                <w:sz w:val="19"/>
+              </w:rPr>
+              <w:t xml:space="preserve"> - 최근 3년 위원 위촉·해촉 사유와 연임 현황</w:t>
+            </w:r>
+          </w:p>
+          <w:p>
+            <w:pPr>
+              <w:spacing w:after="20"/>
+            </w:pPr>
+            <w:r>
+              <w:rPr>
+                <w:rFonts w:ascii="맑은 고딕" w:hAnsi="맑은 고딕" w:eastAsia="맑은 고딕"/>
+                <w:b w:val="0"/>
+                <w:sz w:val="19"/>
+              </w:rPr>
+              <w:t xml:space="preserve"> - 회의록 작성·공개 실적(비공개한 경우 그 사유)</w:t>
+            </w:r>
+          </w:p>
+          <w:p>
+            <w:pPr>
+              <w:spacing w:after="20"/>
+            </w:pPr>
+            <w:r>
+              <w:rPr>
+                <w:rFonts w:ascii="맑은 고딕" w:hAnsi="맑은 고딕" w:eastAsia="맑은 고딕"/>
+                <w:b w:val="0"/>
+                <w:sz w:val="19"/>
+              </w:rPr>
+              <w:t xml:space="preserve"> - 심의 안건과 결과가 사업 선정·예산 배분에 반영된 사례</w:t>
+            </w:r>
+          </w:p>
+        </w:tc>
+        <w:tc>
+          <w:tcPr>
+            <w:tcW w:type="dxa" w:w="1304"/>
+          </w:tcPr>
+          <w:p>
+            <w:pPr>
+              <w:spacing w:after="20"/>
+              <w:jc w:val="center"/>
+            </w:pPr>
+            <w:r/>
+            <w:r>
+              <w:rPr>
+                <w:rFonts w:ascii="맑은 고딕" w:hAnsi="맑은 고딕" w:eastAsia="맑은 고딕"/>
+                <w:b w:val="0"/>
+                <w:sz w:val="17"/>
+              </w:rPr>
+              <w:t>공통-19</w:t>
             </w:r>
           </w:p>
         </w:tc>
@@ -4704,6 +4837,139 @@
           </w:p>
         </w:tc>
       </w:tr>
+      <w:tr>
+        <w:tc>
+          <w:tcPr>
+            <w:tcW w:type="dxa" w:w="737"/>
+          </w:tcPr>
+          <w:p>
+            <w:pPr>
+              <w:spacing w:after="20"/>
+              <w:jc w:val="center"/>
+            </w:pPr>
+            <w:r/>
+            <w:r>
+              <w:rPr>
+                <w:rFonts w:ascii="맑은 고딕" w:hAnsi="맑은 고딕" w:eastAsia="맑은 고딕"/>
+                <w:b w:val="0"/>
+                <w:sz w:val="19"/>
+              </w:rPr>
+              <w:t>6</w:t>
+            </w:r>
+          </w:p>
+        </w:tc>
+        <w:tc>
+          <w:tcPr>
+            <w:tcW w:type="dxa" w:w="1134"/>
+          </w:tcPr>
+          <w:p>
+            <w:pPr>
+              <w:spacing w:after="20"/>
+              <w:jc w:val="center"/>
+            </w:pPr>
+            <w:r/>
+            <w:r>
+              <w:rPr>
+                <w:rFonts w:ascii="맑은 고딕" w:hAnsi="맑은 고딕" w:eastAsia="맑은 고딕"/>
+                <w:b w:val="0"/>
+                <w:sz w:val="19"/>
+              </w:rPr>
+              <w:t>상임위원</w:t>
+            </w:r>
+          </w:p>
+        </w:tc>
+        <w:tc>
+          <w:tcPr>
+            <w:tcW w:type="dxa" w:w="6350"/>
+          </w:tcPr>
+          <w:p>
+            <w:pPr>
+              <w:spacing w:after="20"/>
+            </w:pPr>
+            <w:r/>
+            <w:r>
+              <w:rPr>
+                <w:rFonts w:ascii="맑은 고딕" w:hAnsi="맑은 고딕" w:eastAsia="맑은 고딕"/>
+                <w:b/>
+                <w:sz w:val="19"/>
+              </w:rPr>
+              <w:t>∘ 도 지원 콘텐츠의 저작권·수익배분 조건 (2024~2026. 10.)</w:t>
+            </w:r>
+          </w:p>
+          <w:p>
+            <w:pPr>
+              <w:spacing w:after="20"/>
+            </w:pPr>
+            <w:r>
+              <w:rPr>
+                <w:rFonts w:ascii="맑은 고딕" w:hAnsi="맑은 고딕" w:eastAsia="맑은 고딕"/>
+                <w:b w:val="0"/>
+                <w:sz w:val="19"/>
+              </w:rPr>
+              <w:t xml:space="preserve"> - 제작지원 사업별 협약서상 저작권 귀속과 수익배분 조항</w:t>
+            </w:r>
+          </w:p>
+          <w:p>
+            <w:pPr>
+              <w:spacing w:after="20"/>
+            </w:pPr>
+            <w:r>
+              <w:rPr>
+                <w:rFonts w:ascii="맑은 고딕" w:hAnsi="맑은 고딕" w:eastAsia="맑은 고딕"/>
+                <w:b w:val="0"/>
+                <w:sz w:val="19"/>
+              </w:rPr>
+              <w:t xml:space="preserve"> - 플랫폼(OTT 등)에 IP가 귀속된 사업 건수와 지원금 규모</w:t>
+            </w:r>
+          </w:p>
+          <w:p>
+            <w:pPr>
+              <w:spacing w:after="20"/>
+            </w:pPr>
+            <w:r>
+              <w:rPr>
+                <w:rFonts w:ascii="맑은 고딕" w:hAnsi="맑은 고딕" w:eastAsia="맑은 고딕"/>
+                <w:b w:val="0"/>
+                <w:sz w:val="19"/>
+              </w:rPr>
+              <w:t xml:space="preserve"> - 수익 발생 시 도·진흥원 환수 또는 재투자 실적</w:t>
+            </w:r>
+          </w:p>
+          <w:p>
+            <w:pPr>
+              <w:spacing w:after="20"/>
+            </w:pPr>
+            <w:r>
+              <w:rPr>
+                <w:rFonts w:ascii="맑은 고딕" w:hAnsi="맑은 고딕" w:eastAsia="맑은 고딕"/>
+                <w:b w:val="0"/>
+                <w:sz w:val="19"/>
+              </w:rPr>
+              <w:t xml:space="preserve"> - 창작자 권리 보호를 위한 표준계약서 사용 여부와 점검 결과</w:t>
+            </w:r>
+          </w:p>
+        </w:tc>
+        <w:tc>
+          <w:tcPr>
+            <w:tcW w:type="dxa" w:w="1304"/>
+          </w:tcPr>
+          <w:p>
+            <w:pPr>
+              <w:spacing w:after="20"/>
+              <w:jc w:val="center"/>
+            </w:pPr>
+            <w:r/>
+            <w:r>
+              <w:rPr>
+                <w:rFonts w:ascii="맑은 고딕" w:hAnsi="맑은 고딕" w:eastAsia="맑은 고딕"/>
+                <w:b w:val="0"/>
+                <w:sz w:val="17"/>
+              </w:rPr>
+              <w:t>콘텐츠-6</w:t>
+            </w:r>
+          </w:p>
+        </w:tc>
+      </w:tr>
     </w:tbl>
     <w:p>
       <w:pPr>
@@ -9409,6 +9675,139 @@
           </w:p>
         </w:tc>
       </w:tr>
+      <w:tr>
+        <w:tc>
+          <w:tcPr>
+            <w:tcW w:type="dxa" w:w="737"/>
+          </w:tcPr>
+          <w:p>
+            <w:pPr>
+              <w:spacing w:after="20"/>
+              <w:jc w:val="center"/>
+            </w:pPr>
+            <w:r/>
+            <w:r>
+              <w:rPr>
+                <w:rFonts w:ascii="맑은 고딕" w:hAnsi="맑은 고딕" w:eastAsia="맑은 고딕"/>
+                <w:b w:val="0"/>
+                <w:sz w:val="19"/>
+              </w:rPr>
+              <w:t>3</w:t>
+            </w:r>
+          </w:p>
+        </w:tc>
+        <w:tc>
+          <w:tcPr>
+            <w:tcW w:type="dxa" w:w="1134"/>
+          </w:tcPr>
+          <w:p>
+            <w:pPr>
+              <w:spacing w:after="20"/>
+              <w:jc w:val="center"/>
+            </w:pPr>
+            <w:r/>
+            <w:r>
+              <w:rPr>
+                <w:rFonts w:ascii="맑은 고딕" w:hAnsi="맑은 고딕" w:eastAsia="맑은 고딕"/>
+                <w:b w:val="0"/>
+                <w:sz w:val="19"/>
+              </w:rPr>
+              <w:t>상임위원</w:t>
+            </w:r>
+          </w:p>
+        </w:tc>
+        <w:tc>
+          <w:tcPr>
+            <w:tcW w:type="dxa" w:w="6350"/>
+          </w:tcPr>
+          <w:p>
+            <w:pPr>
+              <w:spacing w:after="20"/>
+            </w:pPr>
+            <w:r/>
+            <w:r>
+              <w:rPr>
+                <w:rFonts w:ascii="맑은 고딕" w:hAnsi="맑은 고딕" w:eastAsia="맑은 고딕"/>
+                <w:b/>
+                <w:sz w:val="19"/>
+              </w:rPr>
+              <w:t>∘ 최근 3년 임직원 비위·징계 처분 내역 (2024~2026. 10.)</w:t>
+            </w:r>
+          </w:p>
+          <w:p>
+            <w:pPr>
+              <w:spacing w:after="20"/>
+            </w:pPr>
+            <w:r>
+              <w:rPr>
+                <w:rFonts w:ascii="맑은 고딕" w:hAnsi="맑은 고딕" w:eastAsia="맑은 고딕"/>
+                <w:b w:val="0"/>
+                <w:sz w:val="19"/>
+              </w:rPr>
+              <w:t xml:space="preserve"> - 사건별 비위 유형, 징계 요구 수위와 실제 처분, 감경·가중 사유</w:t>
+            </w:r>
+          </w:p>
+          <w:p>
+            <w:pPr>
+              <w:spacing w:after="20"/>
+            </w:pPr>
+            <w:r>
+              <w:rPr>
+                <w:rFonts w:ascii="맑은 고딕" w:hAnsi="맑은 고딕" w:eastAsia="맑은 고딕"/>
+                <w:b w:val="0"/>
+                <w:sz w:val="19"/>
+              </w:rPr>
+              <w:t xml:space="preserve"> - 인사위원회·재심위원회 구성(외부위원 포함)과 회의록</w:t>
+            </w:r>
+          </w:p>
+          <w:p>
+            <w:pPr>
+              <w:spacing w:after="20"/>
+            </w:pPr>
+            <w:r>
+              <w:rPr>
+                <w:rFonts w:ascii="맑은 고딕" w:hAnsi="맑은 고딕" w:eastAsia="맑은 고딕"/>
+                <w:b w:val="0"/>
+                <w:sz w:val="19"/>
+              </w:rPr>
+              <w:t xml:space="preserve"> - 재심에서 처분이 변경된 사례와 사유</w:t>
+            </w:r>
+          </w:p>
+          <w:p>
+            <w:pPr>
+              <w:spacing w:after="20"/>
+            </w:pPr>
+            <w:r>
+              <w:rPr>
+                <w:rFonts w:ascii="맑은 고딕" w:hAnsi="맑은 고딕" w:eastAsia="맑은 고딕"/>
+                <w:b w:val="0"/>
+                <w:sz w:val="19"/>
+              </w:rPr>
+              <w:t xml:space="preserve"> - 비위 발생 부서의 후속 관리 조치(인사 조치, 교육, 제도 개선)</w:t>
+            </w:r>
+          </w:p>
+        </w:tc>
+        <w:tc>
+          <w:tcPr>
+            <w:tcW w:type="dxa" w:w="1304"/>
+          </w:tcPr>
+          <w:p>
+            <w:pPr>
+              <w:spacing w:after="20"/>
+              <w:jc w:val="center"/>
+            </w:pPr>
+            <w:r/>
+            <w:r>
+              <w:rPr>
+                <w:rFonts w:ascii="맑은 고딕" w:hAnsi="맑은 고딕" w:eastAsia="맑은 고딕"/>
+                <w:b w:val="0"/>
+                <w:sz w:val="17"/>
+              </w:rPr>
+              <w:t>도자재단-3</w:t>
+            </w:r>
+          </w:p>
+        </w:tc>
+      </w:tr>
     </w:tbl>
     <w:p>
       <w:pPr>
@@ -10274,6 +10673,298 @@
                 <w:sz w:val="17"/>
               </w:rPr>
               <w:t>도체육회-4</w:t>
+            </w:r>
+          </w:p>
+        </w:tc>
+      </w:tr>
+      <w:tr>
+        <w:tc>
+          <w:tcPr>
+            <w:tcW w:type="dxa" w:w="737"/>
+          </w:tcPr>
+          <w:p>
+            <w:pPr>
+              <w:spacing w:after="20"/>
+              <w:jc w:val="center"/>
+            </w:pPr>
+            <w:r/>
+            <w:r>
+              <w:rPr>
+                <w:rFonts w:ascii="맑은 고딕" w:hAnsi="맑은 고딕" w:eastAsia="맑은 고딕"/>
+                <w:b w:val="0"/>
+                <w:sz w:val="19"/>
+              </w:rPr>
+              <w:t>5</w:t>
+            </w:r>
+          </w:p>
+        </w:tc>
+        <w:tc>
+          <w:tcPr>
+            <w:tcW w:type="dxa" w:w="1134"/>
+          </w:tcPr>
+          <w:p>
+            <w:pPr>
+              <w:spacing w:after="20"/>
+              <w:jc w:val="center"/>
+            </w:pPr>
+            <w:r/>
+            <w:r>
+              <w:rPr>
+                <w:rFonts w:ascii="맑은 고딕" w:hAnsi="맑은 고딕" w:eastAsia="맑은 고딕"/>
+                <w:b w:val="0"/>
+                <w:sz w:val="19"/>
+              </w:rPr>
+              <w:t>상임위원</w:t>
+            </w:r>
+          </w:p>
+        </w:tc>
+        <w:tc>
+          <w:tcPr>
+            <w:tcW w:type="dxa" w:w="6350"/>
+          </w:tcPr>
+          <w:p>
+            <w:pPr>
+              <w:spacing w:after="20"/>
+            </w:pPr>
+            <w:r/>
+            <w:r>
+              <w:rPr>
+                <w:rFonts w:ascii="맑은 고딕" w:hAnsi="맑은 고딕" w:eastAsia="맑은 고딕"/>
+                <w:b/>
+                <w:sz w:val="19"/>
+              </w:rPr>
+              <w:t>∘ 민간 체육도장·종목단체 지도자 관리 현황 (2024~2026. 10.)</w:t>
+            </w:r>
+          </w:p>
+          <w:p>
+            <w:pPr>
+              <w:spacing w:after="20"/>
+            </w:pPr>
+            <w:r>
+              <w:rPr>
+                <w:rFonts w:ascii="맑은 고딕" w:hAnsi="맑은 고딕" w:eastAsia="맑은 고딕"/>
+                <w:b w:val="0"/>
+                <w:sz w:val="19"/>
+              </w:rPr>
+              <w:t xml:space="preserve"> - 도내 태권도 등 민간 체육도장 현황과 체육회·시군체육회·종목단체 관리 범위(가맹·비가맹 구분)</w:t>
+            </w:r>
+          </w:p>
+          <w:p>
+            <w:pPr>
+              <w:spacing w:after="20"/>
+            </w:pPr>
+            <w:r>
+              <w:rPr>
+                <w:rFonts w:ascii="맑은 고딕" w:hAnsi="맑은 고딕" w:eastAsia="맑은 고딕"/>
+                <w:b w:val="0"/>
+                <w:sz w:val="19"/>
+              </w:rPr>
+              <w:t xml:space="preserve"> - 체육지도자 자격 확인 및 성범죄·아동학대 관련 취업제한 조회 실시 건수와 적발·조치 내역</w:t>
+            </w:r>
+          </w:p>
+          <w:p>
+            <w:pPr>
+              <w:spacing w:after="20"/>
+            </w:pPr>
+            <w:r>
+              <w:rPr>
+                <w:rFonts w:ascii="맑은 고딕" w:hAnsi="맑은 고딕" w:eastAsia="맑은 고딕"/>
+                <w:b w:val="0"/>
+                <w:sz w:val="19"/>
+              </w:rPr>
+              <w:t xml:space="preserve"> - 최근 3년 도장·종목단체에서 발생한 성범죄·아동학대 사건 접수와 처리 결과(스포츠윤리센터 이첩 포함)</w:t>
+            </w:r>
+          </w:p>
+          <w:p>
+            <w:pPr>
+              <w:spacing w:after="20"/>
+            </w:pPr>
+            <w:r>
+              <w:rPr>
+                <w:rFonts w:ascii="맑은 고딕" w:hAnsi="맑은 고딕" w:eastAsia="맑은 고딕"/>
+                <w:b w:val="0"/>
+                <w:sz w:val="19"/>
+              </w:rPr>
+              <w:t xml:space="preserve"> - 지도자·관장 대상 인권교육 의무 여부, 대상 인원 대비 이수율</w:t>
+            </w:r>
+          </w:p>
+          <w:p>
+            <w:pPr>
+              <w:spacing w:after="20"/>
+            </w:pPr>
+            <w:r>
+              <w:rPr>
+                <w:rFonts w:ascii="맑은 고딕" w:hAnsi="맑은 고딕" w:eastAsia="맑은 고딕"/>
+                <w:b w:val="0"/>
+                <w:sz w:val="19"/>
+              </w:rPr>
+              <w:t xml:space="preserve"> - 피해자 지원·상담 연계 절차와 실제 지원 실적</w:t>
+            </w:r>
+          </w:p>
+          <w:p>
+            <w:pPr>
+              <w:spacing w:after="20"/>
+            </w:pPr>
+            <w:r>
+              <w:rPr>
+                <w:rFonts w:ascii="맑은 고딕" w:hAnsi="맑은 고딕" w:eastAsia="맑은 고딕"/>
+                <w:b w:val="0"/>
+                <w:sz w:val="19"/>
+              </w:rPr>
+              <w:t xml:space="preserve"> - 사건 발생 도장에 대한 시군체육회·종목단체의 조치(제명·자격정지 등) 내역</w:t>
+            </w:r>
+          </w:p>
+        </w:tc>
+        <w:tc>
+          <w:tcPr>
+            <w:tcW w:type="dxa" w:w="1304"/>
+          </w:tcPr>
+          <w:p>
+            <w:pPr>
+              <w:spacing w:after="20"/>
+              <w:jc w:val="center"/>
+            </w:pPr>
+            <w:r/>
+            <w:r>
+              <w:rPr>
+                <w:rFonts w:ascii="맑은 고딕" w:hAnsi="맑은 고딕" w:eastAsia="맑은 고딕"/>
+                <w:b w:val="0"/>
+                <w:sz w:val="17"/>
+              </w:rPr>
+              <w:t>도체육회-5</w:t>
+            </w:r>
+          </w:p>
+        </w:tc>
+      </w:tr>
+      <w:tr>
+        <w:tc>
+          <w:tcPr>
+            <w:tcW w:type="dxa" w:w="737"/>
+          </w:tcPr>
+          <w:p>
+            <w:pPr>
+              <w:spacing w:after="20"/>
+              <w:jc w:val="center"/>
+            </w:pPr>
+            <w:r/>
+            <w:r>
+              <w:rPr>
+                <w:rFonts w:ascii="맑은 고딕" w:hAnsi="맑은 고딕" w:eastAsia="맑은 고딕"/>
+                <w:b w:val="0"/>
+                <w:sz w:val="19"/>
+              </w:rPr>
+              <w:t>6</w:t>
+            </w:r>
+          </w:p>
+        </w:tc>
+        <w:tc>
+          <w:tcPr>
+            <w:tcW w:type="dxa" w:w="1134"/>
+          </w:tcPr>
+          <w:p>
+            <w:pPr>
+              <w:spacing w:after="20"/>
+              <w:jc w:val="center"/>
+            </w:pPr>
+            <w:r/>
+            <w:r>
+              <w:rPr>
+                <w:rFonts w:ascii="맑은 고딕" w:hAnsi="맑은 고딕" w:eastAsia="맑은 고딕"/>
+                <w:b w:val="0"/>
+                <w:sz w:val="19"/>
+              </w:rPr>
+              <w:t>상임위원</w:t>
+            </w:r>
+          </w:p>
+        </w:tc>
+        <w:tc>
+          <w:tcPr>
+            <w:tcW w:type="dxa" w:w="6350"/>
+          </w:tcPr>
+          <w:p>
+            <w:pPr>
+              <w:spacing w:after="20"/>
+            </w:pPr>
+            <w:r/>
+            <w:r>
+              <w:rPr>
+                <w:rFonts w:ascii="맑은 고딕" w:hAnsi="맑은 고딕" w:eastAsia="맑은 고딕"/>
+                <w:b/>
+                <w:sz w:val="19"/>
+              </w:rPr>
+              <w:t>∘ 시군체육회·가맹단체 보조금 정산 및 사례비 세무 처리 점검 현황 (2024~2026. 10.)</w:t>
+            </w:r>
+          </w:p>
+          <w:p>
+            <w:pPr>
+              <w:spacing w:after="20"/>
+            </w:pPr>
+            <w:r>
+              <w:rPr>
+                <w:rFonts w:ascii="맑은 고딕" w:hAnsi="맑은 고딕" w:eastAsia="맑은 고딕"/>
+                <w:b w:val="0"/>
+                <w:sz w:val="19"/>
+              </w:rPr>
+              <w:t xml:space="preserve"> - 시군체육회·종목단체별 보조금 교부액과 정산 완료·지연 현황</w:t>
+            </w:r>
+          </w:p>
+          <w:p>
+            <w:pPr>
+              <w:spacing w:after="20"/>
+            </w:pPr>
+            <w:r>
+              <w:rPr>
+                <w:rFonts w:ascii="맑은 고딕" w:hAnsi="맑은 고딕" w:eastAsia="맑은 고딕"/>
+                <w:b w:val="0"/>
+                <w:sz w:val="19"/>
+              </w:rPr>
+              <w:t xml:space="preserve"> - 심판수당·강사료 등 사례비 지급 시 원천징수 이행 여부 점검 결과</w:t>
+            </w:r>
+          </w:p>
+          <w:p>
+            <w:pPr>
+              <w:spacing w:after="20"/>
+            </w:pPr>
+            <w:r>
+              <w:rPr>
+                <w:rFonts w:ascii="맑은 고딕" w:hAnsi="맑은 고딕" w:eastAsia="맑은 고딕"/>
+                <w:b w:val="0"/>
+                <w:sz w:val="19"/>
+              </w:rPr>
+              <w:t xml:space="preserve"> - 점검에서 확인된 부적정 집행 건수와 환수·시정 조치 내역</w:t>
+            </w:r>
+          </w:p>
+          <w:p>
+            <w:pPr>
+              <w:spacing w:after="20"/>
+            </w:pPr>
+            <w:r>
+              <w:rPr>
+                <w:rFonts w:ascii="맑은 고딕" w:hAnsi="맑은 고딕" w:eastAsia="맑은 고딕"/>
+                <w:b w:val="0"/>
+                <w:sz w:val="19"/>
+              </w:rPr>
+              <w:t xml:space="preserve"> - 정산 지연·미이행 단체에 대한 제재(교부 중단, 관리단체 지정 등) 기준과 적용 사례</w:t>
+            </w:r>
+          </w:p>
+        </w:tc>
+        <w:tc>
+          <w:tcPr>
+            <w:tcW w:type="dxa" w:w="1304"/>
+          </w:tcPr>
+          <w:p>
+            <w:pPr>
+              <w:spacing w:after="20"/>
+              <w:jc w:val="center"/>
+            </w:pPr>
+            <w:r/>
+            <w:r>
+              <w:rPr>
+                <w:rFonts w:ascii="맑은 고딕" w:hAnsi="맑은 고딕" w:eastAsia="맑은 고딕"/>
+                <w:b w:val="0"/>
+                <w:sz w:val="17"/>
+              </w:rPr>
+              <w:t>도체육회-6</w:t>
             </w:r>
           </w:p>
         </w:tc>

</xml_diff>